<commit_message>
Revise preface for clarity and coherence; improve phrasing and remove redundancy.
</commit_message>
<xml_diff>
--- a/poetry/freeform/flotsam-and-jetsam/preface.docx
+++ b/poetry/freeform/flotsam-and-jetsam/preface.docx
@@ -10,7 +10,7 @@
     <w:p/>
     <w:p>
       <w:r>
-        <w:t xml:space="preserve">READ NO FURTHER AND CONTINUE TO BEFORE WE BEGIN if you wish to experience the collection blind. </w:t>
+        <w:t xml:space="preserve">READ NO FURTHER if you wish to experience the collection blind. </w:t>
       </w:r>
     </w:p>
     <w:p/>
@@ -33,10 +33,19 @@
         <w:t xml:space="preserve"> stage</w:t>
       </w:r>
       <w:r>
-        <w:t xml:space="preserve"> of the process</w:t>
-      </w:r>
-      <w:r>
-        <w:t xml:space="preserve">. It explores how people </w:t>
+        <w:t xml:space="preserve"> of </w:t>
+      </w:r>
+      <w:r>
+        <w:t>mourning</w:t>
+      </w:r>
+      <w:r>
+        <w:t xml:space="preserve">. It explores how </w:t>
+      </w:r>
+      <w:r>
+        <w:t>someone</w:t>
+      </w:r>
+      <w:r>
+        <w:t xml:space="preserve"> </w:t>
       </w:r>
       <w:proofErr w:type="spellStart"/>
       <w:r>
@@ -55,7 +64,13 @@
         <w:t xml:space="preserve"> and finally integrate these sorts of losses into their senses of self.</w:t>
       </w:r>
       <w:r>
-        <w:t xml:space="preserve"> Much of the humor of the collection stems from this, especially how grandiose and epic and world-shattering the narrator feels the loss is. </w:t>
+        <w:t xml:space="preserve"> Much of the humor of the collection stems from th</w:t>
+      </w:r>
+      <w:r>
+        <w:t>e juxtaposition of describing relatively mundane loss in literally epic terms</w:t>
+      </w:r>
+      <w:r>
+        <w:t xml:space="preserve">, especially how grandiose and world-shattering the narrator feels the loss is. </w:t>
       </w:r>
     </w:p>
     <w:p/>
@@ -67,15 +82,7 @@
         <w:br/>
       </w:r>
       <w:r>
-        <w:t xml:space="preserve">flotsam and </w:t>
-      </w:r>
-      <w:proofErr w:type="gramStart"/>
-      <w:r>
-        <w:t>jetsam</w:t>
-      </w:r>
-      <w:proofErr w:type="gramEnd"/>
-      <w:r>
-        <w:t xml:space="preserve"> are two nautical terms which are related to debris thrown overboard. Flotsam is debris unintentionally discarded whereas jetsam is debris intentionally cast off. Nautical imagery is a recurring symbol in this collection which </w:t>
+        <w:t xml:space="preserve">flotsam and jetsam are two nautical terms which are related to debris thrown overboard. Flotsam is debris unintentionally discarded whereas jetsam is debris intentionally cast off. Nautical imagery is a recurring symbol in this collection which </w:t>
       </w:r>
       <w:proofErr w:type="spellStart"/>
       <w:r>

</xml_diff>